<commit_message>
Update session export 2026-04-01 (final version, 49 messages)
Co-Authored-By: Claude <noreply@anthropic.com>
</commit_message>
<xml_diff>
--- a/docs/sesiune-2026-04-01.docx
+++ b/docs/sesiune-2026-04-01.docx
@@ -3576,6 +3576,1512 @@
           <w:szCs w:val="20"/>
         </w:rPr>
         <w:t xml:space="preserve">Structura e clară — are `text`, `image`, `document`, `tool_use`. Creez scriptul complet:</w:t>
+      </w:r>
+    </w:p>
+    <w:p>
+      <w:pPr>
+        <w:pBdr>
+          <w:bottom w:val="single" w:color="E5E7EB" w:sz="1"/>
+        </w:pBdr>
+        <w:spacing w:after="200"/>
+      </w:pPr>
+    </w:p>
+    <w:p>
+      <w:pPr>
+        <w:spacing w:after="100" w:before="300"/>
+      </w:pPr>
+      <w:r>
+        <w:rPr>
+          <w:b/>
+          <w:bCs/>
+          <w:color w:val="065F46"/>
+          <w:sz w:val="22"/>
+          <w:szCs w:val="22"/>
+        </w:rPr>
+        <w:t xml:space="preserve">🤖 Claude</w:t>
+      </w:r>
+    </w:p>
+    <w:p>
+      <w:pPr>
+        <w:spacing w:after="60"/>
+      </w:pPr>
+      <w:r>
+        <w:rPr>
+          <w:rFonts w:ascii="DejaVu Sans" w:cs="DejaVu Sans" w:eastAsia="DejaVu Sans" w:hAnsi="DejaVu Sans"/>
+          <w:color w:val="111827"/>
+          <w:sz w:val="20"/>
+          <w:szCs w:val="20"/>
+        </w:rPr>
+        <w:t xml:space="preserve">Funcționează. Fișierele sunt în [docs/sesiune-2026-04-01.docx](docs/sesiune-2026-04-01.docx) și [docs/sesiune-2026-04-01.pdf](docs/sesiune-2026-04-01.pdf).</w:t>
+      </w:r>
+    </w:p>
+    <w:p>
+      <w:pPr>
+        <w:spacing w:after="60"/>
+      </w:pPr>
+      <w:r>
+        <w:rPr>
+          <w:rFonts w:ascii="DejaVu Sans" w:cs="DejaVu Sans" w:eastAsia="DejaVu Sans" w:hAnsi="DejaVu Sans"/>
+          <w:color w:val="111827"/>
+          <w:sz w:val="20"/>
+          <w:szCs w:val="20"/>
+        </w:rPr>
+        <w:t xml:space="preserve"> </w:t>
+      </w:r>
+    </w:p>
+    <w:p>
+      <w:pPr>
+        <w:spacing w:after="60"/>
+      </w:pPr>
+      <w:r>
+        <w:rPr>
+          <w:rFonts w:ascii="DejaVu Sans" w:cs="DejaVu Sans" w:eastAsia="DejaVu Sans" w:hAnsi="DejaVu Sans"/>
+          <w:color w:val="111827"/>
+          <w:sz w:val="20"/>
+          <w:szCs w:val="20"/>
+        </w:rPr>
+        <w:t xml:space="preserve">---</w:t>
+      </w:r>
+    </w:p>
+    <w:p>
+      <w:pPr>
+        <w:spacing w:after="60"/>
+      </w:pPr>
+      <w:r>
+        <w:rPr>
+          <w:rFonts w:ascii="DejaVu Sans" w:cs="DejaVu Sans" w:eastAsia="DejaVu Sans" w:hAnsi="DejaVu Sans"/>
+          <w:color w:val="111827"/>
+          <w:sz w:val="20"/>
+          <w:szCs w:val="20"/>
+        </w:rPr>
+        <w:t xml:space="preserve"> </w:t>
+      </w:r>
+    </w:p>
+    <w:p>
+      <w:pPr>
+        <w:spacing w:after="60"/>
+      </w:pPr>
+      <w:r>
+        <w:rPr>
+          <w:rFonts w:ascii="DejaVu Sans" w:cs="DejaVu Sans" w:eastAsia="DejaVu Sans" w:hAnsi="DejaVu Sans"/>
+          <w:color w:val="111827"/>
+          <w:sz w:val="20"/>
+          <w:szCs w:val="20"/>
+        </w:rPr>
+        <w:t xml:space="preserve">**Răspuns la întrebarea ta despre capturi de ecran:**</w:t>
+      </w:r>
+    </w:p>
+    <w:p>
+      <w:pPr>
+        <w:spacing w:after="60"/>
+      </w:pPr>
+      <w:r>
+        <w:rPr>
+          <w:rFonts w:ascii="DejaVu Sans" w:cs="DejaVu Sans" w:eastAsia="DejaVu Sans" w:hAnsi="DejaVu Sans"/>
+          <w:color w:val="111827"/>
+          <w:sz w:val="20"/>
+          <w:szCs w:val="20"/>
+        </w:rPr>
+        <w:t xml:space="preserve"> </w:t>
+      </w:r>
+    </w:p>
+    <w:p>
+      <w:pPr>
+        <w:spacing w:after="60"/>
+      </w:pPr>
+      <w:r>
+        <w:rPr>
+          <w:rFonts w:ascii="DejaVu Sans" w:cs="DejaVu Sans" w:eastAsia="DejaVu Sans" w:hAnsi="DejaVu Sans"/>
+          <w:color w:val="111827"/>
+          <w:sz w:val="20"/>
+          <w:szCs w:val="20"/>
+        </w:rPr>
+        <w:t xml:space="preserve">Capturile pe care mi le dai **sunt deja salvate** în fișierul sesiunii (base64). Scriptul le extrage automat și le inserează în docx/pdf exact la locul lor în conversație — exact cum ai văzut că am procesat imaginea cu Supabase Dashboard.</w:t>
+      </w:r>
+    </w:p>
+    <w:p>
+      <w:pPr>
+        <w:spacing w:after="60"/>
+      </w:pPr>
+      <w:r>
+        <w:rPr>
+          <w:rFonts w:ascii="DejaVu Sans" w:cs="DejaVu Sans" w:eastAsia="DejaVu Sans" w:hAnsi="DejaVu Sans"/>
+          <w:color w:val="111827"/>
+          <w:sz w:val="20"/>
+          <w:szCs w:val="20"/>
+        </w:rPr>
+        <w:t xml:space="preserve"> </w:t>
+      </w:r>
+    </w:p>
+    <w:p>
+      <w:pPr>
+        <w:spacing w:after="60"/>
+      </w:pPr>
+      <w:r>
+        <w:rPr>
+          <w:rFonts w:ascii="DejaVu Sans" w:cs="DejaVu Sans" w:eastAsia="DejaVu Sans" w:hAnsi="DejaVu Sans"/>
+          <w:color w:val="111827"/>
+          <w:sz w:val="20"/>
+          <w:szCs w:val="20"/>
+        </w:rPr>
+        <w:t xml:space="preserve">---</w:t>
+      </w:r>
+    </w:p>
+    <w:p>
+      <w:pPr>
+        <w:spacing w:after="60"/>
+      </w:pPr>
+      <w:r>
+        <w:rPr>
+          <w:rFonts w:ascii="DejaVu Sans" w:cs="DejaVu Sans" w:eastAsia="DejaVu Sans" w:hAnsi="DejaVu Sans"/>
+          <w:color w:val="111827"/>
+          <w:sz w:val="20"/>
+          <w:szCs w:val="20"/>
+        </w:rPr>
+        <w:t xml:space="preserve"> </w:t>
+      </w:r>
+    </w:p>
+    <w:p>
+      <w:pPr>
+        <w:spacing w:after="60"/>
+      </w:pPr>
+      <w:r>
+        <w:rPr>
+          <w:rFonts w:ascii="DejaVu Sans" w:cs="DejaVu Sans" w:eastAsia="DejaVu Sans" w:hAnsi="DejaVu Sans"/>
+          <w:color w:val="111827"/>
+          <w:sz w:val="20"/>
+          <w:szCs w:val="20"/>
+        </w:rPr>
+        <w:t xml:space="preserve">**Cum folosești scriptul data viitoare:**</w:t>
+      </w:r>
+    </w:p>
+    <w:p>
+      <w:pPr>
+        <w:spacing w:after="60"/>
+      </w:pPr>
+      <w:r>
+        <w:rPr>
+          <w:rFonts w:ascii="DejaVu Sans" w:cs="DejaVu Sans" w:eastAsia="DejaVu Sans" w:hAnsi="DejaVu Sans"/>
+          <w:color w:val="111827"/>
+          <w:sz w:val="20"/>
+          <w:szCs w:val="20"/>
+        </w:rPr>
+        <w:t xml:space="preserve">```bash</w:t>
+      </w:r>
+    </w:p>
+    <w:p>
+      <w:pPr>
+        <w:spacing w:after="60"/>
+      </w:pPr>
+      <w:r>
+        <w:rPr>
+          <w:rFonts w:ascii="DejaVu Sans" w:cs="DejaVu Sans" w:eastAsia="DejaVu Sans" w:hAnsi="DejaVu Sans"/>
+          <w:color w:val="111827"/>
+          <w:sz w:val="20"/>
+          <w:szCs w:val="20"/>
+        </w:rPr>
+        <w:t xml:space="preserve"># Exportă sesiunea curentă (cea mai recentă)</w:t>
+      </w:r>
+    </w:p>
+    <w:p>
+      <w:pPr>
+        <w:spacing w:after="60"/>
+      </w:pPr>
+      <w:r>
+        <w:rPr>
+          <w:rFonts w:ascii="DejaVu Sans" w:cs="DejaVu Sans" w:eastAsia="DejaVu Sans" w:hAnsi="DejaVu Sans"/>
+          <w:color w:val="111827"/>
+          <w:sz w:val="20"/>
+          <w:szCs w:val="20"/>
+        </w:rPr>
+        <w:t xml:space="preserve">node scripts/export-chat.mjs</w:t>
+      </w:r>
+    </w:p>
+    <w:p>
+      <w:pPr>
+        <w:spacing w:after="60"/>
+      </w:pPr>
+      <w:r>
+        <w:rPr>
+          <w:rFonts w:ascii="DejaVu Sans" w:cs="DejaVu Sans" w:eastAsia="DejaVu Sans" w:hAnsi="DejaVu Sans"/>
+          <w:color w:val="111827"/>
+          <w:sz w:val="20"/>
+          <w:szCs w:val="20"/>
+        </w:rPr>
+        <w:t xml:space="preserve"> </w:t>
+      </w:r>
+    </w:p>
+    <w:p>
+      <w:pPr>
+        <w:spacing w:after="60"/>
+      </w:pPr>
+      <w:r>
+        <w:rPr>
+          <w:rFonts w:ascii="DejaVu Sans" w:cs="DejaVu Sans" w:eastAsia="DejaVu Sans" w:hAnsi="DejaVu Sans"/>
+          <w:color w:val="111827"/>
+          <w:sz w:val="20"/>
+          <w:szCs w:val="20"/>
+        </w:rPr>
+        <w:t xml:space="preserve"># Exportă o sesiune specifică după ID</w:t>
+      </w:r>
+    </w:p>
+    <w:p>
+      <w:pPr>
+        <w:spacing w:after="60"/>
+      </w:pPr>
+      <w:r>
+        <w:rPr>
+          <w:rFonts w:ascii="DejaVu Sans" w:cs="DejaVu Sans" w:eastAsia="DejaVu Sans" w:hAnsi="DejaVu Sans"/>
+          <w:color w:val="111827"/>
+          <w:sz w:val="20"/>
+          <w:szCs w:val="20"/>
+        </w:rPr>
+        <w:t xml:space="preserve">node scripts/export-chat.mjs 860c8625</w:t>
+      </w:r>
+    </w:p>
+    <w:p>
+      <w:pPr>
+        <w:spacing w:after="60"/>
+      </w:pPr>
+      <w:r>
+        <w:rPr>
+          <w:rFonts w:ascii="DejaVu Sans" w:cs="DejaVu Sans" w:eastAsia="DejaVu Sans" w:hAnsi="DejaVu Sans"/>
+          <w:color w:val="111827"/>
+          <w:sz w:val="20"/>
+          <w:szCs w:val="20"/>
+        </w:rPr>
+        <w:t xml:space="preserve">```</w:t>
+      </w:r>
+    </w:p>
+    <w:p>
+      <w:pPr>
+        <w:pBdr>
+          <w:bottom w:val="single" w:color="E5E7EB" w:sz="1"/>
+        </w:pBdr>
+        <w:spacing w:after="200"/>
+      </w:pPr>
+    </w:p>
+    <w:p>
+      <w:pPr>
+        <w:spacing w:after="100" w:before="300"/>
+      </w:pPr>
+      <w:r>
+        <w:rPr>
+          <w:b/>
+          <w:bCs/>
+          <w:color w:val="1D4ED8"/>
+          <w:sz w:val="22"/>
+          <w:szCs w:val="22"/>
+        </w:rPr>
+        <w:t xml:space="preserve">👤 Tu</w:t>
+      </w:r>
+    </w:p>
+    <w:p>
+      <w:pPr>
+        <w:spacing w:after="60"/>
+      </w:pPr>
+      <w:r>
+        <w:rPr>
+          <w:rFonts w:ascii="DejaVu Sans" w:cs="DejaVu Sans" w:eastAsia="DejaVu Sans" w:hAnsi="DejaVu Sans"/>
+          <w:color w:val="111827"/>
+          <w:sz w:val="20"/>
+          <w:szCs w:val="20"/>
+        </w:rPr>
+        <w:t xml:space="preserve">Acum vreau să exporți toate sesiunile mele (de la început în ordine cronologică după dată) în fișiere separate (docx și pdf) pentru fiecare sesiune. Ai înțeles ?</w:t>
+      </w:r>
+    </w:p>
+    <w:p>
+      <w:pPr>
+        <w:pBdr>
+          <w:bottom w:val="single" w:color="E5E7EB" w:sz="1"/>
+        </w:pBdr>
+        <w:spacing w:after="200"/>
+      </w:pPr>
+    </w:p>
+    <w:p>
+      <w:pPr>
+        <w:spacing w:after="100" w:before="300"/>
+      </w:pPr>
+      <w:r>
+        <w:rPr>
+          <w:b/>
+          <w:bCs/>
+          <w:color w:val="065F46"/>
+          <w:sz w:val="22"/>
+          <w:szCs w:val="22"/>
+        </w:rPr>
+        <w:t xml:space="preserve">🤖 Claude</w:t>
+      </w:r>
+    </w:p>
+    <w:p>
+      <w:pPr>
+        <w:spacing w:after="60"/>
+      </w:pPr>
+      <w:r>
+        <w:rPr>
+          <w:rFonts w:ascii="DejaVu Sans" w:cs="DejaVu Sans" w:eastAsia="DejaVu Sans" w:hAnsi="DejaVu Sans"/>
+          <w:color w:val="111827"/>
+          <w:sz w:val="20"/>
+          <w:szCs w:val="20"/>
+        </w:rPr>
+        <w:t xml:space="preserve">Da, am înțeles. Înainte să rulez, hai să vedem câte sesiuni sunt:</w:t>
+      </w:r>
+    </w:p>
+    <w:p>
+      <w:pPr>
+        <w:pBdr>
+          <w:bottom w:val="single" w:color="E5E7EB" w:sz="1"/>
+        </w:pBdr>
+        <w:spacing w:after="200"/>
+      </w:pPr>
+    </w:p>
+    <w:p>
+      <w:pPr>
+        <w:spacing w:after="100" w:before="300"/>
+      </w:pPr>
+      <w:r>
+        <w:rPr>
+          <w:b/>
+          <w:bCs/>
+          <w:color w:val="065F46"/>
+          <w:sz w:val="22"/>
+          <w:szCs w:val="22"/>
+        </w:rPr>
+        <w:t xml:space="preserve">🤖 Claude</w:t>
+      </w:r>
+    </w:p>
+    <w:p>
+      <w:pPr>
+        <w:spacing w:after="60"/>
+      </w:pPr>
+      <w:r>
+        <w:rPr>
+          <w:rFonts w:ascii="DejaVu Sans" w:cs="DejaVu Sans" w:eastAsia="DejaVu Sans" w:hAnsi="DejaVu Sans"/>
+          <w:color w:val="111827"/>
+          <w:sz w:val="20"/>
+          <w:szCs w:val="20"/>
+        </w:rPr>
+        <w:t xml:space="preserve">13 sesiuni din 23 martie până azi. Le export pe toate:</w:t>
+      </w:r>
+    </w:p>
+    <w:p>
+      <w:pPr>
+        <w:pBdr>
+          <w:bottom w:val="single" w:color="E5E7EB" w:sz="1"/>
+        </w:pBdr>
+        <w:spacing w:after="200"/>
+      </w:pPr>
+    </w:p>
+    <w:p>
+      <w:pPr>
+        <w:spacing w:after="100" w:before="300"/>
+      </w:pPr>
+      <w:r>
+        <w:rPr>
+          <w:b/>
+          <w:bCs/>
+          <w:color w:val="065F46"/>
+          <w:sz w:val="22"/>
+          <w:szCs w:val="22"/>
+        </w:rPr>
+        <w:t xml:space="preserve">🤖 Claude</w:t>
+      </w:r>
+    </w:p>
+    <w:p>
+      <w:pPr>
+        <w:spacing w:after="60"/>
+      </w:pPr>
+      <w:r>
+        <w:rPr>
+          <w:rFonts w:ascii="DejaVu Sans" w:cs="DejaVu Sans" w:eastAsia="DejaVu Sans" w:hAnsi="DejaVu Sans"/>
+          <w:color w:val="111827"/>
+          <w:sz w:val="20"/>
+          <w:szCs w:val="20"/>
+        </w:rPr>
+        <w:t xml:space="preserve">Unele zile au mai multe sesiuni — voi numerota: `sesiune-2026-03-29-1`, `sesiune-2026-03-29-2` etc. Rulez exportul:</w:t>
+      </w:r>
+    </w:p>
+    <w:p>
+      <w:pPr>
+        <w:pBdr>
+          <w:bottom w:val="single" w:color="E5E7EB" w:sz="1"/>
+        </w:pBdr>
+        <w:spacing w:after="200"/>
+      </w:pPr>
+    </w:p>
+    <w:p>
+      <w:pPr>
+        <w:spacing w:after="100" w:before="300"/>
+      </w:pPr>
+      <w:r>
+        <w:rPr>
+          <w:b/>
+          <w:bCs/>
+          <w:color w:val="065F46"/>
+          <w:sz w:val="22"/>
+          <w:szCs w:val="22"/>
+        </w:rPr>
+        <w:t xml:space="preserve">🤖 Claude</w:t>
+      </w:r>
+    </w:p>
+    <w:p>
+      <w:pPr>
+        <w:spacing w:after="60"/>
+      </w:pPr>
+      <w:r>
+        <w:rPr>
+          <w:rFonts w:ascii="DejaVu Sans" w:cs="DejaVu Sans" w:eastAsia="DejaVu Sans" w:hAnsi="DejaVu Sans"/>
+          <w:color w:val="111827"/>
+          <w:sz w:val="20"/>
+          <w:szCs w:val="20"/>
+        </w:rPr>
+        <w:t xml:space="preserve">Gata! **13 sesiuni exportate** în [docs/sesiuni/](docs/sesiuni/) — câte un `.docx` și `.pdf` pentru fiecare:</w:t>
+      </w:r>
+    </w:p>
+    <w:p>
+      <w:pPr>
+        <w:spacing w:after="60"/>
+      </w:pPr>
+      <w:r>
+        <w:rPr>
+          <w:rFonts w:ascii="DejaVu Sans" w:cs="DejaVu Sans" w:eastAsia="DejaVu Sans" w:hAnsi="DejaVu Sans"/>
+          <w:color w:val="111827"/>
+          <w:sz w:val="20"/>
+          <w:szCs w:val="20"/>
+        </w:rPr>
+        <w:t xml:space="preserve"> </w:t>
+      </w:r>
+    </w:p>
+    <w:p>
+      <w:pPr>
+        <w:spacing w:after="60"/>
+      </w:pPr>
+      <w:r>
+        <w:rPr>
+          <w:rFonts w:ascii="DejaVu Sans" w:cs="DejaVu Sans" w:eastAsia="DejaVu Sans" w:hAnsi="DejaVu Sans"/>
+          <w:color w:val="111827"/>
+          <w:sz w:val="20"/>
+          <w:szCs w:val="20"/>
+        </w:rPr>
+        <w:t xml:space="preserve">| Sesiune | Mesaje |</w:t>
+      </w:r>
+    </w:p>
+    <w:p>
+      <w:pPr>
+        <w:spacing w:after="60"/>
+      </w:pPr>
+      <w:r>
+        <w:rPr>
+          <w:rFonts w:ascii="DejaVu Sans" w:cs="DejaVu Sans" w:eastAsia="DejaVu Sans" w:hAnsi="DejaVu Sans"/>
+          <w:color w:val="111827"/>
+          <w:sz w:val="20"/>
+          <w:szCs w:val="20"/>
+        </w:rPr>
+        <w:t xml:space="preserve">|---|---|</w:t>
+      </w:r>
+    </w:p>
+    <w:p>
+      <w:pPr>
+        <w:spacing w:after="60"/>
+      </w:pPr>
+      <w:r>
+        <w:rPr>
+          <w:rFonts w:ascii="DejaVu Sans" w:cs="DejaVu Sans" w:eastAsia="DejaVu Sans" w:hAnsi="DejaVu Sans"/>
+          <w:color w:val="111827"/>
+          <w:sz w:val="20"/>
+          <w:szCs w:val="20"/>
+        </w:rPr>
+        <w:t xml:space="preserve">| 2026-03-23 | 52 |</w:t>
+      </w:r>
+    </w:p>
+    <w:p>
+      <w:pPr>
+        <w:spacing w:after="60"/>
+      </w:pPr>
+      <w:r>
+        <w:rPr>
+          <w:rFonts w:ascii="DejaVu Sans" w:cs="DejaVu Sans" w:eastAsia="DejaVu Sans" w:hAnsi="DejaVu Sans"/>
+          <w:color w:val="111827"/>
+          <w:sz w:val="20"/>
+          <w:szCs w:val="20"/>
+        </w:rPr>
+        <w:t xml:space="preserve">| 2026-03-24 (1 și 2) | 103 / 92 |</w:t>
+      </w:r>
+    </w:p>
+    <w:p>
+      <w:pPr>
+        <w:spacing w:after="60"/>
+      </w:pPr>
+      <w:r>
+        <w:rPr>
+          <w:rFonts w:ascii="DejaVu Sans" w:cs="DejaVu Sans" w:eastAsia="DejaVu Sans" w:hAnsi="DejaVu Sans"/>
+          <w:color w:val="111827"/>
+          <w:sz w:val="20"/>
+          <w:szCs w:val="20"/>
+        </w:rPr>
+        <w:t xml:space="preserve">| 2026-03-25 | 130 |</w:t>
+      </w:r>
+    </w:p>
+    <w:p>
+      <w:pPr>
+        <w:spacing w:after="60"/>
+      </w:pPr>
+      <w:r>
+        <w:rPr>
+          <w:rFonts w:ascii="DejaVu Sans" w:cs="DejaVu Sans" w:eastAsia="DejaVu Sans" w:hAnsi="DejaVu Sans"/>
+          <w:color w:val="111827"/>
+          <w:sz w:val="20"/>
+          <w:szCs w:val="20"/>
+        </w:rPr>
+        <w:t xml:space="preserve">| 2026-03-29 (1-4) | 13 / 100 / 79 / 192 |</w:t>
+      </w:r>
+    </w:p>
+    <w:p>
+      <w:pPr>
+        <w:spacing w:after="60"/>
+      </w:pPr>
+      <w:r>
+        <w:rPr>
+          <w:rFonts w:ascii="DejaVu Sans" w:cs="DejaVu Sans" w:eastAsia="DejaVu Sans" w:hAnsi="DejaVu Sans"/>
+          <w:color w:val="111827"/>
+          <w:sz w:val="20"/>
+          <w:szCs w:val="20"/>
+        </w:rPr>
+        <w:t xml:space="preserve">| 2026-03-31 (1-4) | 165 / 178 / 18 / 56 |</w:t>
+      </w:r>
+    </w:p>
+    <w:p>
+      <w:pPr>
+        <w:spacing w:after="60"/>
+      </w:pPr>
+      <w:r>
+        <w:rPr>
+          <w:rFonts w:ascii="DejaVu Sans" w:cs="DejaVu Sans" w:eastAsia="DejaVu Sans" w:hAnsi="DejaVu Sans"/>
+          <w:color w:val="111827"/>
+          <w:sz w:val="20"/>
+          <w:szCs w:val="20"/>
+        </w:rPr>
+        <w:t xml:space="preserve">| 2026-04-01 | 36 |</w:t>
+      </w:r>
+    </w:p>
+    <w:p>
+      <w:pPr>
+        <w:spacing w:after="60"/>
+      </w:pPr>
+      <w:r>
+        <w:rPr>
+          <w:rFonts w:ascii="DejaVu Sans" w:cs="DejaVu Sans" w:eastAsia="DejaVu Sans" w:hAnsi="DejaVu Sans"/>
+          <w:color w:val="111827"/>
+          <w:sz w:val="20"/>
+          <w:szCs w:val="20"/>
+        </w:rPr>
+        <w:t xml:space="preserve"> </w:t>
+      </w:r>
+    </w:p>
+    <w:p>
+      <w:pPr>
+        <w:spacing w:after="60"/>
+      </w:pPr>
+      <w:r>
+        <w:rPr>
+          <w:rFonts w:ascii="DejaVu Sans" w:cs="DejaVu Sans" w:eastAsia="DejaVu Sans" w:hAnsi="DejaVu Sans"/>
+          <w:color w:val="111827"/>
+          <w:sz w:val="20"/>
+          <w:szCs w:val="20"/>
+        </w:rPr>
+        <w:t xml:space="preserve">Capturile de ecran pe care mi le-ai dat sunt incluse automat în documente la locul lor din conversație.</w:t>
+      </w:r>
+    </w:p>
+    <w:p>
+      <w:pPr>
+        <w:pBdr>
+          <w:bottom w:val="single" w:color="E5E7EB" w:sz="1"/>
+        </w:pBdr>
+        <w:spacing w:after="200"/>
+      </w:pPr>
+    </w:p>
+    <w:p>
+      <w:pPr>
+        <w:spacing w:after="100" w:before="300"/>
+      </w:pPr>
+      <w:r>
+        <w:rPr>
+          <w:b/>
+          <w:bCs/>
+          <w:color w:val="1D4ED8"/>
+          <w:sz w:val="22"/>
+          <w:szCs w:val="22"/>
+        </w:rPr>
+        <w:t xml:space="preserve">👤 Tu</w:t>
+      </w:r>
+    </w:p>
+    <w:p>
+      <w:pPr>
+        <w:spacing w:after="60"/>
+      </w:pPr>
+      <w:r>
+        <w:rPr>
+          <w:rFonts w:ascii="DejaVu Sans" w:cs="DejaVu Sans" w:eastAsia="DejaVu Sans" w:hAnsi="DejaVu Sans"/>
+          <w:color w:val="111827"/>
+          <w:sz w:val="20"/>
+          <w:szCs w:val="20"/>
+        </w:rPr>
+        <w:t xml:space="preserve">Poți să adaugi acest export de sesiune ca o comandă, de fiecare dată când se termină sesiunea?</w:t>
+      </w:r>
+    </w:p>
+    <w:p>
+      <w:pPr>
+        <w:pBdr>
+          <w:bottom w:val="single" w:color="E5E7EB" w:sz="1"/>
+        </w:pBdr>
+        <w:spacing w:after="200"/>
+      </w:pPr>
+    </w:p>
+    <w:p>
+      <w:pPr>
+        <w:spacing w:after="100" w:before="300"/>
+      </w:pPr>
+      <w:r>
+        <w:rPr>
+          <w:b/>
+          <w:bCs/>
+          <w:color w:val="065F46"/>
+          <w:sz w:val="22"/>
+          <w:szCs w:val="22"/>
+        </w:rPr>
+        <w:t xml:space="preserve">🤖 Claude</w:t>
+      </w:r>
+    </w:p>
+    <w:p>
+      <w:pPr>
+        <w:spacing w:after="60"/>
+      </w:pPr>
+      <w:r>
+        <w:rPr>
+          <w:rFonts w:ascii="DejaVu Sans" w:cs="DejaVu Sans" w:eastAsia="DejaVu Sans" w:hAnsi="DejaVu Sans"/>
+          <w:color w:val="111827"/>
+          <w:sz w:val="20"/>
+          <w:szCs w:val="20"/>
+        </w:rPr>
+        <w:t xml:space="preserve">Gata. Acum `/end` include automat la pasul 8 exportul sesiunii. De fiecare dată când rulezi `/end`, vei primi fișierele `.docx` și `.pdf` în `docs/sesiuni/`.</w:t>
+      </w:r>
+    </w:p>
+    <w:p>
+      <w:pPr>
+        <w:pBdr>
+          <w:bottom w:val="single" w:color="E5E7EB" w:sz="1"/>
+        </w:pBdr>
+        <w:spacing w:after="200"/>
+      </w:pPr>
+    </w:p>
+    <w:p>
+      <w:pPr>
+        <w:spacing w:after="100" w:before="300"/>
+      </w:pPr>
+      <w:r>
+        <w:rPr>
+          <w:b/>
+          <w:bCs/>
+          <w:color w:val="1D4ED8"/>
+          <w:sz w:val="22"/>
+          <w:szCs w:val="22"/>
+        </w:rPr>
+        <w:t xml:space="preserve">👤 Tu</w:t>
+      </w:r>
+    </w:p>
+    <w:p>
+      <w:pPr>
+        <w:spacing w:after="60"/>
+      </w:pPr>
+      <w:r>
+        <w:rPr>
+          <w:rFonts w:ascii="DejaVu Sans" w:cs="DejaVu Sans" w:eastAsia="DejaVu Sans" w:hAnsi="DejaVu Sans"/>
+          <w:color w:val="111827"/>
+          <w:sz w:val="20"/>
+          <w:szCs w:val="20"/>
+        </w:rPr>
+        <w:t xml:space="preserve">&lt;ide_opened_file&gt;The user opened the file c:\Users\Admin\.claude\commands\end.md in the IDE. This may or may not be related to the current task.&lt;/ide_opened_file&gt;</w:t>
+      </w:r>
+    </w:p>
+    <w:p>
+      <w:pPr>
+        <w:spacing w:after="60"/>
+      </w:pPr>
+      <w:r>
+        <w:rPr>
+          <w:rFonts w:ascii="DejaVu Sans" w:cs="DejaVu Sans" w:eastAsia="DejaVu Sans" w:hAnsi="DejaVu Sans"/>
+          <w:color w:val="111827"/>
+          <w:sz w:val="20"/>
+          <w:szCs w:val="20"/>
+        </w:rPr>
+        <w:t xml:space="preserve">Excelent.</w:t>
+      </w:r>
+    </w:p>
+    <w:p>
+      <w:pPr>
+        <w:pBdr>
+          <w:bottom w:val="single" w:color="E5E7EB" w:sz="1"/>
+        </w:pBdr>
+        <w:spacing w:after="200"/>
+      </w:pPr>
+    </w:p>
+    <w:p>
+      <w:pPr>
+        <w:spacing w:after="100" w:before="300"/>
+      </w:pPr>
+      <w:r>
+        <w:rPr>
+          <w:b/>
+          <w:bCs/>
+          <w:color w:val="065F46"/>
+          <w:sz w:val="22"/>
+          <w:szCs w:val="22"/>
+        </w:rPr>
+        <w:t xml:space="preserve">🤖 Claude</w:t>
+      </w:r>
+    </w:p>
+    <w:p>
+      <w:pPr>
+        <w:spacing w:after="60"/>
+      </w:pPr>
+      <w:r>
+        <w:rPr>
+          <w:rFonts w:ascii="DejaVu Sans" w:cs="DejaVu Sans" w:eastAsia="DejaVu Sans" w:hAnsi="DejaVu Sans"/>
+          <w:color w:val="111827"/>
+          <w:sz w:val="20"/>
+          <w:szCs w:val="20"/>
+        </w:rPr>
+        <w:t xml:space="preserve">Mulțumesc! Hai să salvăm și modificările de azi.</w:t>
+      </w:r>
+    </w:p>
+    <w:p>
+      <w:pPr>
+        <w:pBdr>
+          <w:bottom w:val="single" w:color="E5E7EB" w:sz="1"/>
+        </w:pBdr>
+        <w:spacing w:after="200"/>
+      </w:pPr>
+    </w:p>
+    <w:p>
+      <w:pPr>
+        <w:spacing w:after="100" w:before="300"/>
+      </w:pPr>
+      <w:r>
+        <w:rPr>
+          <w:b/>
+          <w:bCs/>
+          <w:color w:val="1D4ED8"/>
+          <w:sz w:val="22"/>
+          <w:szCs w:val="22"/>
+        </w:rPr>
+        <w:t xml:space="preserve">👤 Tu</w:t>
+      </w:r>
+    </w:p>
+    <w:p>
+      <w:pPr>
+        <w:spacing w:after="60"/>
+      </w:pPr>
+      <w:r>
+        <w:rPr>
+          <w:rFonts w:ascii="DejaVu Sans" w:cs="DejaVu Sans" w:eastAsia="DejaVu Sans" w:hAnsi="DejaVu Sans"/>
+          <w:color w:val="111827"/>
+          <w:sz w:val="20"/>
+          <w:szCs w:val="20"/>
+        </w:rPr>
+        <w:t xml:space="preserve"># /end - Sfarsitul sesiunii de lucru</w:t>
+      </w:r>
+    </w:p>
+    <w:p>
+      <w:pPr>
+        <w:spacing w:after="60"/>
+      </w:pPr>
+      <w:r>
+        <w:rPr>
+          <w:rFonts w:ascii="DejaVu Sans" w:cs="DejaVu Sans" w:eastAsia="DejaVu Sans" w:hAnsi="DejaVu Sans"/>
+          <w:color w:val="111827"/>
+          <w:sz w:val="20"/>
+          <w:szCs w:val="20"/>
+        </w:rPr>
+        <w:t xml:space="preserve"> </w:t>
+      </w:r>
+    </w:p>
+    <w:p>
+      <w:pPr>
+        <w:spacing w:after="60"/>
+      </w:pPr>
+      <w:r>
+        <w:rPr>
+          <w:rFonts w:ascii="DejaVu Sans" w:cs="DejaVu Sans" w:eastAsia="DejaVu Sans" w:hAnsi="DejaVu Sans"/>
+          <w:color w:val="111827"/>
+          <w:sz w:val="20"/>
+          <w:szCs w:val="20"/>
+        </w:rPr>
+        <w:t xml:space="preserve">Ruleaza la finalul fiecarei sesiuni:</w:t>
+      </w:r>
+    </w:p>
+    <w:p>
+      <w:pPr>
+        <w:spacing w:after="60"/>
+      </w:pPr>
+      <w:r>
+        <w:rPr>
+          <w:rFonts w:ascii="DejaVu Sans" w:cs="DejaVu Sans" w:eastAsia="DejaVu Sans" w:hAnsi="DejaVu Sans"/>
+          <w:color w:val="111827"/>
+          <w:sz w:val="20"/>
+          <w:szCs w:val="20"/>
+        </w:rPr>
+        <w:t xml:space="preserve"> </w:t>
+      </w:r>
+    </w:p>
+    <w:p>
+      <w:pPr>
+        <w:spacing w:after="60"/>
+      </w:pPr>
+      <w:r>
+        <w:rPr>
+          <w:rFonts w:ascii="DejaVu Sans" w:cs="DejaVu Sans" w:eastAsia="DejaVu Sans" w:hAnsi="DejaVu Sans"/>
+          <w:color w:val="111827"/>
+          <w:sz w:val="20"/>
+          <w:szCs w:val="20"/>
+        </w:rPr>
+        <w:t xml:space="preserve">1. Verifica daca sunt modificari nesalvate</w:t>
+      </w:r>
+    </w:p>
+    <w:p>
+      <w:pPr>
+        <w:spacing w:after="60"/>
+      </w:pPr>
+      <w:r>
+        <w:rPr>
+          <w:rFonts w:ascii="DejaVu Sans" w:cs="DejaVu Sans" w:eastAsia="DejaVu Sans" w:hAnsi="DejaVu Sans"/>
+          <w:color w:val="111827"/>
+          <w:sz w:val="20"/>
+          <w:szCs w:val="20"/>
+        </w:rPr>
+        <w:t xml:space="preserve">2. Daca da, intreaba userul daca vrea sa faca commit</w:t>
+      </w:r>
+    </w:p>
+    <w:p>
+      <w:pPr>
+        <w:spacing w:after="60"/>
+      </w:pPr>
+      <w:r>
+        <w:rPr>
+          <w:rFonts w:ascii="DejaVu Sans" w:cs="DejaVu Sans" w:eastAsia="DejaVu Sans" w:hAnsi="DejaVu Sans"/>
+          <w:color w:val="111827"/>
+          <w:sz w:val="20"/>
+          <w:szCs w:val="20"/>
+        </w:rPr>
+        <w:t xml:space="preserve">3. Verifica daca sunt commit-uri nepush-uite</w:t>
+      </w:r>
+    </w:p>
+    <w:p>
+      <w:pPr>
+        <w:spacing w:after="60"/>
+      </w:pPr>
+      <w:r>
+        <w:rPr>
+          <w:rFonts w:ascii="DejaVu Sans" w:cs="DejaVu Sans" w:eastAsia="DejaVu Sans" w:hAnsi="DejaVu Sans"/>
+          <w:color w:val="111827"/>
+          <w:sz w:val="20"/>
+          <w:szCs w:val="20"/>
+        </w:rPr>
+        <w:t xml:space="preserve">4. Daca da, intreaba userul daca vrea sa faca push</w:t>
+      </w:r>
+    </w:p>
+    <w:p>
+      <w:pPr>
+        <w:spacing w:after="60"/>
+      </w:pPr>
+      <w:r>
+        <w:rPr>
+          <w:rFonts w:ascii="DejaVu Sans" w:cs="DejaVu Sans" w:eastAsia="DejaVu Sans" w:hAnsi="DejaVu Sans"/>
+          <w:color w:val="111827"/>
+          <w:sz w:val="20"/>
+          <w:szCs w:val="20"/>
+        </w:rPr>
+        <w:t xml:space="preserve">5. Rezuma ce s-a lucrat in sesiune</w:t>
+      </w:r>
+    </w:p>
+    <w:p>
+      <w:pPr>
+        <w:spacing w:after="60"/>
+      </w:pPr>
+      <w:r>
+        <w:rPr>
+          <w:rFonts w:ascii="DejaVu Sans" w:cs="DejaVu Sans" w:eastAsia="DejaVu Sans" w:hAnsi="DejaVu Sans"/>
+          <w:color w:val="111827"/>
+          <w:sz w:val="20"/>
+          <w:szCs w:val="20"/>
+        </w:rPr>
+        <w:t xml:space="preserve">6. Întreabă userul dacă există un to do list pentru sesiunea viitoare.</w:t>
+      </w:r>
+    </w:p>
+    <w:p>
+      <w:pPr>
+        <w:spacing w:after="60"/>
+      </w:pPr>
+      <w:r>
+        <w:rPr>
+          <w:rFonts w:ascii="DejaVu Sans" w:cs="DejaVu Sans" w:eastAsia="DejaVu Sans" w:hAnsi="DejaVu Sans"/>
+          <w:color w:val="111827"/>
+          <w:sz w:val="20"/>
+          <w:szCs w:val="20"/>
+        </w:rPr>
+        <w:t xml:space="preserve">7. Salvează tot ce este nevoie pentru global memory și ce e specific de salvat pentru proiect</w:t>
+      </w:r>
+    </w:p>
+    <w:p>
+      <w:pPr>
+        <w:spacing w:after="60"/>
+      </w:pPr>
+      <w:r>
+        <w:rPr>
+          <w:rFonts w:ascii="DejaVu Sans" w:cs="DejaVu Sans" w:eastAsia="DejaVu Sans" w:hAnsi="DejaVu Sans"/>
+          <w:color w:val="111827"/>
+          <w:sz w:val="20"/>
+          <w:szCs w:val="20"/>
+        </w:rPr>
+        <w:t xml:space="preserve">8. Exportă sesiunea curentă în DOCX și PDF rulând: `node scripts/export-chat.mjs` din directorul proiectului</w:t>
+      </w:r>
+    </w:p>
+    <w:p>
+      <w:pPr>
+        <w:pBdr>
+          <w:bottom w:val="single" w:color="E5E7EB" w:sz="1"/>
+        </w:pBdr>
+        <w:spacing w:after="200"/>
+      </w:pPr>
+    </w:p>
+    <w:p>
+      <w:pPr>
+        <w:spacing w:after="100" w:before="300"/>
+      </w:pPr>
+      <w:r>
+        <w:rPr>
+          <w:b/>
+          <w:bCs/>
+          <w:color w:val="065F46"/>
+          <w:sz w:val="22"/>
+          <w:szCs w:val="22"/>
+        </w:rPr>
+        <w:t xml:space="preserve">🤖 Claude</w:t>
+      </w:r>
+    </w:p>
+    <w:p>
+      <w:pPr>
+        <w:spacing w:after="60"/>
+      </w:pPr>
+      <w:r>
+        <w:rPr>
+          <w:rFonts w:ascii="DejaVu Sans" w:cs="DejaVu Sans" w:eastAsia="DejaVu Sans" w:hAnsi="DejaVu Sans"/>
+          <w:color w:val="111827"/>
+          <w:sz w:val="20"/>
+          <w:szCs w:val="20"/>
+        </w:rPr>
+        <w:t xml:space="preserve">Sunt fișiere noi nesalvate:</w:t>
+      </w:r>
+    </w:p>
+    <w:p>
+      <w:pPr>
+        <w:spacing w:after="60"/>
+      </w:pPr>
+      <w:r>
+        <w:rPr>
+          <w:rFonts w:ascii="DejaVu Sans" w:cs="DejaVu Sans" w:eastAsia="DejaVu Sans" w:hAnsi="DejaVu Sans"/>
+          <w:color w:val="111827"/>
+          <w:sz w:val="20"/>
+          <w:szCs w:val="20"/>
+        </w:rPr>
+        <w:t xml:space="preserve">- `scripts/export-chat.mjs` — scriptul de export</w:t>
+      </w:r>
+    </w:p>
+    <w:p>
+      <w:pPr>
+        <w:spacing w:after="60"/>
+      </w:pPr>
+      <w:r>
+        <w:rPr>
+          <w:rFonts w:ascii="DejaVu Sans" w:cs="DejaVu Sans" w:eastAsia="DejaVu Sans" w:hAnsi="DejaVu Sans"/>
+          <w:color w:val="111827"/>
+          <w:sz w:val="20"/>
+          <w:szCs w:val="20"/>
+        </w:rPr>
+        <w:t xml:space="preserve">- `docs/sesiuni/` — toate sesiunile exportate</w:t>
+      </w:r>
+    </w:p>
+    <w:p>
+      <w:pPr>
+        <w:spacing w:after="60"/>
+      </w:pPr>
+      <w:r>
+        <w:rPr>
+          <w:rFonts w:ascii="DejaVu Sans" w:cs="DejaVu Sans" w:eastAsia="DejaVu Sans" w:hAnsi="DejaVu Sans"/>
+          <w:color w:val="111827"/>
+          <w:sz w:val="20"/>
+          <w:szCs w:val="20"/>
+        </w:rPr>
+        <w:t xml:space="preserve">- `docs/sesiune-2026-04-01.docx/pdf` — exportul de test</w:t>
+      </w:r>
+    </w:p>
+    <w:p>
+      <w:pPr>
+        <w:spacing w:after="60"/>
+      </w:pPr>
+      <w:r>
+        <w:rPr>
+          <w:rFonts w:ascii="DejaVu Sans" w:cs="DejaVu Sans" w:eastAsia="DejaVu Sans" w:hAnsi="DejaVu Sans"/>
+          <w:color w:val="111827"/>
+          <w:sz w:val="20"/>
+          <w:szCs w:val="20"/>
+        </w:rPr>
+        <w:t xml:space="preserve"> </w:t>
+      </w:r>
+    </w:p>
+    <w:p>
+      <w:pPr>
+        <w:spacing w:after="60"/>
+      </w:pPr>
+      <w:r>
+        <w:rPr>
+          <w:rFonts w:ascii="DejaVu Sans" w:cs="DejaVu Sans" w:eastAsia="DejaVu Sans" w:hAnsi="DejaVu Sans"/>
+          <w:color w:val="111827"/>
+          <w:sz w:val="20"/>
+          <w:szCs w:val="20"/>
+        </w:rPr>
+        <w:t xml:space="preserve">Vrei să fac commit cu acestea?</w:t>
+      </w:r>
+    </w:p>
+    <w:p>
+      <w:pPr>
+        <w:pBdr>
+          <w:bottom w:val="single" w:color="E5E7EB" w:sz="1"/>
+        </w:pBdr>
+        <w:spacing w:after="200"/>
+      </w:pPr>
+    </w:p>
+    <w:p>
+      <w:pPr>
+        <w:spacing w:after="100" w:before="300"/>
+      </w:pPr>
+      <w:r>
+        <w:rPr>
+          <w:b/>
+          <w:bCs/>
+          <w:color w:val="1D4ED8"/>
+          <w:sz w:val="22"/>
+          <w:szCs w:val="22"/>
+        </w:rPr>
+        <w:t xml:space="preserve">👤 Tu</w:t>
+      </w:r>
+    </w:p>
+    <w:p>
+      <w:pPr>
+        <w:spacing w:after="60"/>
+      </w:pPr>
+      <w:r>
+        <w:rPr>
+          <w:rFonts w:ascii="DejaVu Sans" w:cs="DejaVu Sans" w:eastAsia="DejaVu Sans" w:hAnsi="DejaVu Sans"/>
+          <w:color w:val="111827"/>
+          <w:sz w:val="20"/>
+          <w:szCs w:val="20"/>
+        </w:rPr>
+        <w:t xml:space="preserve">da</w:t>
+      </w:r>
+    </w:p>
+    <w:p>
+      <w:pPr>
+        <w:pBdr>
+          <w:bottom w:val="single" w:color="E5E7EB" w:sz="1"/>
+        </w:pBdr>
+        <w:spacing w:after="200"/>
+      </w:pPr>
+    </w:p>
+    <w:p>
+      <w:pPr>
+        <w:spacing w:after="100" w:before="300"/>
+      </w:pPr>
+      <w:r>
+        <w:rPr>
+          <w:b/>
+          <w:bCs/>
+          <w:color w:val="065F46"/>
+          <w:sz w:val="22"/>
+          <w:szCs w:val="22"/>
+        </w:rPr>
+        <w:t xml:space="preserve">🤖 Claude</w:t>
+      </w:r>
+    </w:p>
+    <w:p>
+      <w:pPr>
+        <w:spacing w:after="60"/>
+      </w:pPr>
+      <w:r>
+        <w:rPr>
+          <w:rFonts w:ascii="DejaVu Sans" w:cs="DejaVu Sans" w:eastAsia="DejaVu Sans" w:hAnsi="DejaVu Sans"/>
+          <w:color w:val="111827"/>
+          <w:sz w:val="20"/>
+          <w:szCs w:val="20"/>
+        </w:rPr>
+        <w:t xml:space="preserve">Commit făcut: `d0efce9`. Vrei să faci și push pe GitHub?</w:t>
+      </w:r>
+    </w:p>
+    <w:p>
+      <w:pPr>
+        <w:pBdr>
+          <w:bottom w:val="single" w:color="E5E7EB" w:sz="1"/>
+        </w:pBdr>
+        <w:spacing w:after="200"/>
+      </w:pPr>
+    </w:p>
+    <w:p>
+      <w:pPr>
+        <w:spacing w:after="100" w:before="300"/>
+      </w:pPr>
+      <w:r>
+        <w:rPr>
+          <w:b/>
+          <w:bCs/>
+          <w:color w:val="1D4ED8"/>
+          <w:sz w:val="22"/>
+          <w:szCs w:val="22"/>
+        </w:rPr>
+        <w:t xml:space="preserve">👤 Tu</w:t>
+      </w:r>
+    </w:p>
+    <w:p>
+      <w:pPr>
+        <w:spacing w:after="60"/>
+      </w:pPr>
+      <w:r>
+        <w:rPr>
+          <w:rFonts w:ascii="DejaVu Sans" w:cs="DejaVu Sans" w:eastAsia="DejaVu Sans" w:hAnsi="DejaVu Sans"/>
+          <w:color w:val="111827"/>
+          <w:sz w:val="20"/>
+          <w:szCs w:val="20"/>
+        </w:rPr>
+        <w:t xml:space="preserve">da. salvăm absolut tot.</w:t>
+      </w:r>
+    </w:p>
+    <w:p>
+      <w:pPr>
+        <w:pBdr>
+          <w:bottom w:val="single" w:color="E5E7EB" w:sz="1"/>
+        </w:pBdr>
+        <w:spacing w:after="200"/>
+      </w:pPr>
+    </w:p>
+    <w:p>
+      <w:pPr>
+        <w:spacing w:after="100" w:before="300"/>
+      </w:pPr>
+      <w:r>
+        <w:rPr>
+          <w:b/>
+          <w:bCs/>
+          <w:color w:val="065F46"/>
+          <w:sz w:val="22"/>
+          <w:szCs w:val="22"/>
+        </w:rPr>
+        <w:t xml:space="preserve">🤖 Claude</w:t>
+      </w:r>
+    </w:p>
+    <w:p>
+      <w:pPr>
+        <w:spacing w:after="60"/>
+      </w:pPr>
+      <w:r>
+        <w:rPr>
+          <w:rFonts w:ascii="DejaVu Sans" w:cs="DejaVu Sans" w:eastAsia="DejaVu Sans" w:hAnsi="DejaVu Sans"/>
+          <w:color w:val="111827"/>
+          <w:sz w:val="20"/>
+          <w:szCs w:val="20"/>
+        </w:rPr>
+        <w:t xml:space="preserve">Push reușit. Tot pe GitHub acum.</w:t>
+      </w:r>
+    </w:p>
+    <w:p>
+      <w:pPr>
+        <w:spacing w:after="60"/>
+      </w:pPr>
+      <w:r>
+        <w:rPr>
+          <w:rFonts w:ascii="DejaVu Sans" w:cs="DejaVu Sans" w:eastAsia="DejaVu Sans" w:hAnsi="DejaVu Sans"/>
+          <w:color w:val="111827"/>
+          <w:sz w:val="20"/>
+          <w:szCs w:val="20"/>
+        </w:rPr>
+        <w:t xml:space="preserve"> </w:t>
+      </w:r>
+    </w:p>
+    <w:p>
+      <w:pPr>
+        <w:spacing w:after="60"/>
+      </w:pPr>
+      <w:r>
+        <w:rPr>
+          <w:rFonts w:ascii="DejaVu Sans" w:cs="DejaVu Sans" w:eastAsia="DejaVu Sans" w:hAnsi="DejaVu Sans"/>
+          <w:color w:val="111827"/>
+          <w:sz w:val="20"/>
+          <w:szCs w:val="20"/>
+        </w:rPr>
+        <w:t xml:space="preserve">---</w:t>
+      </w:r>
+    </w:p>
+    <w:p>
+      <w:pPr>
+        <w:spacing w:after="60"/>
+      </w:pPr>
+      <w:r>
+        <w:rPr>
+          <w:rFonts w:ascii="DejaVu Sans" w:cs="DejaVu Sans" w:eastAsia="DejaVu Sans" w:hAnsi="DejaVu Sans"/>
+          <w:color w:val="111827"/>
+          <w:sz w:val="20"/>
+          <w:szCs w:val="20"/>
+        </w:rPr>
+        <w:t xml:space="preserve"> </w:t>
+      </w:r>
+    </w:p>
+    <w:p>
+      <w:pPr>
+        <w:spacing w:after="60"/>
+      </w:pPr>
+      <w:r>
+        <w:rPr>
+          <w:rFonts w:ascii="DejaVu Sans" w:cs="DejaVu Sans" w:eastAsia="DejaVu Sans" w:hAnsi="DejaVu Sans"/>
+          <w:color w:val="111827"/>
+          <w:sz w:val="20"/>
+          <w:szCs w:val="20"/>
+        </w:rPr>
+        <w:t xml:space="preserve">**Rezumat sesiune 1 aprilie 2026:**</w:t>
+      </w:r>
+    </w:p>
+    <w:p>
+      <w:pPr>
+        <w:spacing w:after="60"/>
+      </w:pPr>
+      <w:r>
+        <w:rPr>
+          <w:rFonts w:ascii="DejaVu Sans" w:cs="DejaVu Sans" w:eastAsia="DejaVu Sans" w:hAnsi="DejaVu Sans"/>
+          <w:color w:val="111827"/>
+          <w:sz w:val="20"/>
+          <w:szCs w:val="20"/>
+        </w:rPr>
+        <w:t xml:space="preserve"> </w:t>
+      </w:r>
+    </w:p>
+    <w:p>
+      <w:pPr>
+        <w:spacing w:after="60"/>
+      </w:pPr>
+      <w:r>
+        <w:rPr>
+          <w:rFonts w:ascii="DejaVu Sans" w:cs="DejaVu Sans" w:eastAsia="DejaVu Sans" w:hAnsi="DejaVu Sans"/>
+          <w:color w:val="111827"/>
+          <w:sz w:val="20"/>
+          <w:szCs w:val="20"/>
+        </w:rPr>
+        <w:t xml:space="preserve">- ✅ Rezolvat vulnerabilitate Supabase — RLS activat pe toate tabelele</w:t>
+      </w:r>
+    </w:p>
+    <w:p>
+      <w:pPr>
+        <w:spacing w:after="60"/>
+      </w:pPr>
+      <w:r>
+        <w:rPr>
+          <w:rFonts w:ascii="DejaVu Sans" w:cs="DejaVu Sans" w:eastAsia="DejaVu Sans" w:hAnsi="DejaVu Sans"/>
+          <w:color w:val="111827"/>
+          <w:sz w:val="20"/>
+          <w:szCs w:val="20"/>
+        </w:rPr>
+        <w:t xml:space="preserve">- ✅ Script `export-chat.mjs` — exportă sesiunile în DOCX + PDF cu capturi de ecran</w:t>
+      </w:r>
+    </w:p>
+    <w:p>
+      <w:pPr>
+        <w:spacing w:after="60"/>
+      </w:pPr>
+      <w:r>
+        <w:rPr>
+          <w:rFonts w:ascii="DejaVu Sans" w:cs="DejaVu Sans" w:eastAsia="DejaVu Sans" w:hAnsi="DejaVu Sans"/>
+          <w:color w:val="111827"/>
+          <w:sz w:val="20"/>
+          <w:szCs w:val="20"/>
+        </w:rPr>
+        <w:t xml:space="preserve">- ✅ Toate cele 13 sesiuni exportate în `docs/sesiuni/`</w:t>
+      </w:r>
+    </w:p>
+    <w:p>
+      <w:pPr>
+        <w:spacing w:after="60"/>
+      </w:pPr>
+      <w:r>
+        <w:rPr>
+          <w:rFonts w:ascii="DejaVu Sans" w:cs="DejaVu Sans" w:eastAsia="DejaVu Sans" w:hAnsi="DejaVu Sans"/>
+          <w:color w:val="111827"/>
+          <w:sz w:val="20"/>
+          <w:szCs w:val="20"/>
+        </w:rPr>
+        <w:t xml:space="preserve">- ✅ `/end` actualizat — exportul rulează automat la fiecare final de sesiune</w:t>
+      </w:r>
+    </w:p>
+    <w:p>
+      <w:pPr>
+        <w:spacing w:after="60"/>
+      </w:pPr>
+      <w:r>
+        <w:rPr>
+          <w:rFonts w:ascii="DejaVu Sans" w:cs="DejaVu Sans" w:eastAsia="DejaVu Sans" w:hAnsi="DejaVu Sans"/>
+          <w:color w:val="111827"/>
+          <w:sz w:val="20"/>
+          <w:szCs w:val="20"/>
+        </w:rPr>
+        <w:t xml:space="preserve"> </w:t>
+      </w:r>
+    </w:p>
+    <w:p>
+      <w:pPr>
+        <w:spacing w:after="60"/>
+      </w:pPr>
+      <w:r>
+        <w:rPr>
+          <w:rFonts w:ascii="DejaVu Sans" w:cs="DejaVu Sans" w:eastAsia="DejaVu Sans" w:hAnsi="DejaVu Sans"/>
+          <w:color w:val="111827"/>
+          <w:sz w:val="20"/>
+          <w:szCs w:val="20"/>
+        </w:rPr>
+        <w:t xml:space="preserve">---</w:t>
+      </w:r>
+    </w:p>
+    <w:p>
+      <w:pPr>
+        <w:spacing w:after="60"/>
+      </w:pPr>
+      <w:r>
+        <w:rPr>
+          <w:rFonts w:ascii="DejaVu Sans" w:cs="DejaVu Sans" w:eastAsia="DejaVu Sans" w:hAnsi="DejaVu Sans"/>
+          <w:color w:val="111827"/>
+          <w:sz w:val="20"/>
+          <w:szCs w:val="20"/>
+        </w:rPr>
+        <w:t xml:space="preserve"> </w:t>
+      </w:r>
+    </w:p>
+    <w:p>
+      <w:pPr>
+        <w:spacing w:after="60"/>
+      </w:pPr>
+      <w:r>
+        <w:rPr>
+          <w:rFonts w:ascii="DejaVu Sans" w:cs="DejaVu Sans" w:eastAsia="DejaVu Sans" w:hAnsi="DejaVu Sans"/>
+          <w:color w:val="111827"/>
+          <w:sz w:val="20"/>
+          <w:szCs w:val="20"/>
+        </w:rPr>
+        <w:t xml:space="preserve">Ai un to-do list pentru sesiunea viitoare?</w:t>
+      </w:r>
+    </w:p>
+    <w:p>
+      <w:pPr>
+        <w:pBdr>
+          <w:bottom w:val="single" w:color="E5E7EB" w:sz="1"/>
+        </w:pBdr>
+        <w:spacing w:after="200"/>
+      </w:pPr>
+    </w:p>
+    <w:p>
+      <w:pPr>
+        <w:spacing w:after="100" w:before="300"/>
+      </w:pPr>
+      <w:r>
+        <w:rPr>
+          <w:b/>
+          <w:bCs/>
+          <w:color w:val="1D4ED8"/>
+          <w:sz w:val="22"/>
+          <w:szCs w:val="22"/>
+        </w:rPr>
+        <w:t xml:space="preserve">👤 Tu</w:t>
+      </w:r>
+    </w:p>
+    <w:p>
+      <w:pPr>
+        <w:spacing w:after="60"/>
+      </w:pPr>
+      <w:r>
+        <w:rPr>
+          <w:rFonts w:ascii="DejaVu Sans" w:cs="DejaVu Sans" w:eastAsia="DejaVu Sans" w:hAnsi="DejaVu Sans"/>
+          <w:color w:val="111827"/>
+          <w:sz w:val="20"/>
+          <w:szCs w:val="20"/>
+        </w:rPr>
+        <w:t xml:space="preserve">Da. </w:t>
+      </w:r>
+    </w:p>
+    <w:p>
+      <w:pPr>
+        <w:spacing w:after="60"/>
+      </w:pPr>
+      <w:r>
+        <w:rPr>
+          <w:rFonts w:ascii="DejaVu Sans" w:cs="DejaVu Sans" w:eastAsia="DejaVu Sans" w:hAnsi="DejaVu Sans"/>
+          <w:color w:val="111827"/>
+          <w:sz w:val="20"/>
+          <w:szCs w:val="20"/>
+        </w:rPr>
+        <w:t xml:space="preserve">Se începe alt proiect. explicat în Modulul 4. </w:t>
+      </w:r>
+    </w:p>
+    <w:p>
+      <w:pPr>
+        <w:spacing w:after="60"/>
+      </w:pPr>
+      <w:r>
+        <w:rPr>
+          <w:rFonts w:ascii="DejaVu Sans" w:cs="DejaVu Sans" w:eastAsia="DejaVu Sans" w:hAnsi="DejaVu Sans"/>
+          <w:color w:val="111827"/>
+          <w:sz w:val="20"/>
+          <w:szCs w:val="20"/>
+        </w:rPr>
+        <w:t xml:space="preserve">Sunt 3 lecții de învățat.</w:t>
+      </w:r>
+    </w:p>
+    <w:p>
+      <w:pPr>
+        <w:pBdr>
+          <w:bottom w:val="single" w:color="E5E7EB" w:sz="1"/>
+        </w:pBdr>
+        <w:spacing w:after="200"/>
+      </w:pPr>
+    </w:p>
+    <w:p>
+      <w:pPr>
+        <w:spacing w:after="100" w:before="300"/>
+      </w:pPr>
+      <w:r>
+        <w:rPr>
+          <w:b/>
+          <w:bCs/>
+          <w:color w:val="065F46"/>
+          <w:sz w:val="22"/>
+          <w:szCs w:val="22"/>
+        </w:rPr>
+        <w:t xml:space="preserve">🤖 Claude</w:t>
+      </w:r>
+    </w:p>
+    <w:p>
+      <w:pPr>
+        <w:spacing w:after="60"/>
+      </w:pPr>
+      <w:r>
+        <w:rPr>
+          <w:rFonts w:ascii="DejaVu Sans" w:cs="DejaVu Sans" w:eastAsia="DejaVu Sans" w:hAnsi="DejaVu Sans"/>
+          <w:color w:val="111827"/>
+          <w:sz w:val="20"/>
+          <w:szCs w:val="20"/>
+        </w:rPr>
+        <w:t xml:space="preserve">Salvat în memorie. Acum exportul sesiunii:</w:t>
       </w:r>
     </w:p>
     <w:p>

</xml_diff>

<commit_message>
Export sesiune 2026-04-03 (final, 124 mesaje) + update scripturi
Co-Authored-By: Claude Sonnet 4.6 <noreply@anthropic.com>
</commit_message>
<xml_diff>
--- a/docs/sesiune-2026-04-01.docx
+++ b/docs/sesiune-2026-04-01.docx
@@ -5082,6 +5082,480 @@
           <w:szCs w:val="20"/>
         </w:rPr>
         <w:t xml:space="preserve">Salvat în memorie. Acum exportul sesiunii:</w:t>
+      </w:r>
+    </w:p>
+    <w:p>
+      <w:pPr>
+        <w:pBdr>
+          <w:bottom w:val="single" w:color="E5E7EB" w:sz="1"/>
+        </w:pBdr>
+        <w:spacing w:after="200"/>
+      </w:pPr>
+    </w:p>
+    <w:p>
+      <w:pPr>
+        <w:spacing w:after="100" w:before="300"/>
+      </w:pPr>
+      <w:r>
+        <w:rPr>
+          <w:b/>
+          <w:bCs/>
+          <w:color w:val="065F46"/>
+          <w:sz w:val="22"/>
+          <w:szCs w:val="22"/>
+        </w:rPr>
+        <w:t xml:space="preserve">🤖 Claude</w:t>
+      </w:r>
+    </w:p>
+    <w:p>
+      <w:pPr>
+        <w:spacing w:after="60"/>
+      </w:pPr>
+      <w:r>
+        <w:rPr>
+          <w:rFonts w:ascii="DejaVu Sans" w:cs="DejaVu Sans" w:eastAsia="DejaVu Sans" w:hAnsi="DejaVu Sans"/>
+          <w:color w:val="111827"/>
+          <w:sz w:val="20"/>
+          <w:szCs w:val="20"/>
+        </w:rPr>
+        <w:t xml:space="preserve">Sesiunea exportată: [docs/sesiune-2026-04-01.docx](docs/sesiune-2026-04-01.docx) și [docs/sesiune-2026-04-01.pdf](docs/sesiune-2026-04-01.pdf) — 49 mesaje inclusiv capturile de ecran cu Supabase.</w:t>
+      </w:r>
+    </w:p>
+    <w:p>
+      <w:pPr>
+        <w:spacing w:after="60"/>
+      </w:pPr>
+      <w:r>
+        <w:rPr>
+          <w:rFonts w:ascii="DejaVu Sans" w:cs="DejaVu Sans" w:eastAsia="DejaVu Sans" w:hAnsi="DejaVu Sans"/>
+          <w:color w:val="111827"/>
+          <w:sz w:val="20"/>
+          <w:szCs w:val="20"/>
+        </w:rPr>
+        <w:t xml:space="preserve"> </w:t>
+      </w:r>
+    </w:p>
+    <w:p>
+      <w:pPr>
+        <w:spacing w:after="60"/>
+      </w:pPr>
+      <w:r>
+        <w:rPr>
+          <w:rFonts w:ascii="DejaVu Sans" w:cs="DejaVu Sans" w:eastAsia="DejaVu Sans" w:hAnsi="DejaVu Sans"/>
+          <w:color w:val="111827"/>
+          <w:sz w:val="20"/>
+          <w:szCs w:val="20"/>
+        </w:rPr>
+        <w:t xml:space="preserve">**La sesiunea viitoare:** Modul 4 — proiect nou, 3 lecții de parcurs. Pe curând!</w:t>
+      </w:r>
+    </w:p>
+    <w:p>
+      <w:pPr>
+        <w:pBdr>
+          <w:bottom w:val="single" w:color="E5E7EB" w:sz="1"/>
+        </w:pBdr>
+        <w:spacing w:after="200"/>
+      </w:pPr>
+    </w:p>
+    <w:p>
+      <w:pPr>
+        <w:spacing w:after="100" w:before="300"/>
+      </w:pPr>
+      <w:r>
+        <w:rPr>
+          <w:b/>
+          <w:bCs/>
+          <w:color w:val="1D4ED8"/>
+          <w:sz w:val="22"/>
+          <w:szCs w:val="22"/>
+        </w:rPr>
+        <w:t xml:space="preserve">👤 Tu</w:t>
+      </w:r>
+    </w:p>
+    <w:p>
+      <w:pPr>
+        <w:spacing w:after="60"/>
+      </w:pPr>
+      <w:r>
+        <w:rPr>
+          <w:rFonts w:ascii="DejaVu Sans" w:cs="DejaVu Sans" w:eastAsia="DejaVu Sans" w:hAnsi="DejaVu Sans"/>
+          <w:color w:val="111827"/>
+          <w:sz w:val="20"/>
+          <w:szCs w:val="20"/>
+        </w:rPr>
+        <w:t xml:space="preserve">&lt;command-message&gt;end&lt;/command-message&gt;</w:t>
+      </w:r>
+    </w:p>
+    <w:p>
+      <w:pPr>
+        <w:spacing w:after="60"/>
+      </w:pPr>
+      <w:r>
+        <w:rPr>
+          <w:rFonts w:ascii="DejaVu Sans" w:cs="DejaVu Sans" w:eastAsia="DejaVu Sans" w:hAnsi="DejaVu Sans"/>
+          <w:color w:val="111827"/>
+          <w:sz w:val="20"/>
+          <w:szCs w:val="20"/>
+        </w:rPr>
+        <w:t xml:space="preserve">&lt;command-name&gt;/end&lt;/command-name&gt;</w:t>
+      </w:r>
+    </w:p>
+    <w:p>
+      <w:pPr>
+        <w:pBdr>
+          <w:bottom w:val="single" w:color="E5E7EB" w:sz="1"/>
+        </w:pBdr>
+        <w:spacing w:after="200"/>
+      </w:pPr>
+    </w:p>
+    <w:p>
+      <w:pPr>
+        <w:spacing w:after="100" w:before="300"/>
+      </w:pPr>
+      <w:r>
+        <w:rPr>
+          <w:b/>
+          <w:bCs/>
+          <w:color w:val="1D4ED8"/>
+          <w:sz w:val="22"/>
+          <w:szCs w:val="22"/>
+        </w:rPr>
+        <w:t xml:space="preserve">👤 Tu</w:t>
+      </w:r>
+    </w:p>
+    <w:p>
+      <w:pPr>
+        <w:spacing w:after="60"/>
+      </w:pPr>
+      <w:r>
+        <w:rPr>
+          <w:rFonts w:ascii="DejaVu Sans" w:cs="DejaVu Sans" w:eastAsia="DejaVu Sans" w:hAnsi="DejaVu Sans"/>
+          <w:color w:val="111827"/>
+          <w:sz w:val="20"/>
+          <w:szCs w:val="20"/>
+        </w:rPr>
+        <w:t xml:space="preserve"># /end - Sfarsitul sesiunii de lucru</w:t>
+      </w:r>
+    </w:p>
+    <w:p>
+      <w:pPr>
+        <w:spacing w:after="60"/>
+      </w:pPr>
+      <w:r>
+        <w:rPr>
+          <w:rFonts w:ascii="DejaVu Sans" w:cs="DejaVu Sans" w:eastAsia="DejaVu Sans" w:hAnsi="DejaVu Sans"/>
+          <w:color w:val="111827"/>
+          <w:sz w:val="20"/>
+          <w:szCs w:val="20"/>
+        </w:rPr>
+        <w:t xml:space="preserve"> </w:t>
+      </w:r>
+    </w:p>
+    <w:p>
+      <w:pPr>
+        <w:spacing w:after="60"/>
+      </w:pPr>
+      <w:r>
+        <w:rPr>
+          <w:rFonts w:ascii="DejaVu Sans" w:cs="DejaVu Sans" w:eastAsia="DejaVu Sans" w:hAnsi="DejaVu Sans"/>
+          <w:color w:val="111827"/>
+          <w:sz w:val="20"/>
+          <w:szCs w:val="20"/>
+        </w:rPr>
+        <w:t xml:space="preserve">Ruleaza la finalul fiecarei sesiuni:</w:t>
+      </w:r>
+    </w:p>
+    <w:p>
+      <w:pPr>
+        <w:spacing w:after="60"/>
+      </w:pPr>
+      <w:r>
+        <w:rPr>
+          <w:rFonts w:ascii="DejaVu Sans" w:cs="DejaVu Sans" w:eastAsia="DejaVu Sans" w:hAnsi="DejaVu Sans"/>
+          <w:color w:val="111827"/>
+          <w:sz w:val="20"/>
+          <w:szCs w:val="20"/>
+        </w:rPr>
+        <w:t xml:space="preserve"> </w:t>
+      </w:r>
+    </w:p>
+    <w:p>
+      <w:pPr>
+        <w:spacing w:after="60"/>
+      </w:pPr>
+      <w:r>
+        <w:rPr>
+          <w:rFonts w:ascii="DejaVu Sans" w:cs="DejaVu Sans" w:eastAsia="DejaVu Sans" w:hAnsi="DejaVu Sans"/>
+          <w:color w:val="111827"/>
+          <w:sz w:val="20"/>
+          <w:szCs w:val="20"/>
+        </w:rPr>
+        <w:t xml:space="preserve">1. Verifica daca sunt modificari nesalvate</w:t>
+      </w:r>
+    </w:p>
+    <w:p>
+      <w:pPr>
+        <w:spacing w:after="60"/>
+      </w:pPr>
+      <w:r>
+        <w:rPr>
+          <w:rFonts w:ascii="DejaVu Sans" w:cs="DejaVu Sans" w:eastAsia="DejaVu Sans" w:hAnsi="DejaVu Sans"/>
+          <w:color w:val="111827"/>
+          <w:sz w:val="20"/>
+          <w:szCs w:val="20"/>
+        </w:rPr>
+        <w:t xml:space="preserve">2. Daca da, intreaba userul daca vrea sa faca commit</w:t>
+      </w:r>
+    </w:p>
+    <w:p>
+      <w:pPr>
+        <w:spacing w:after="60"/>
+      </w:pPr>
+      <w:r>
+        <w:rPr>
+          <w:rFonts w:ascii="DejaVu Sans" w:cs="DejaVu Sans" w:eastAsia="DejaVu Sans" w:hAnsi="DejaVu Sans"/>
+          <w:color w:val="111827"/>
+          <w:sz w:val="20"/>
+          <w:szCs w:val="20"/>
+        </w:rPr>
+        <w:t xml:space="preserve">3. Verifica daca sunt commit-uri nepush-uite</w:t>
+      </w:r>
+    </w:p>
+    <w:p>
+      <w:pPr>
+        <w:spacing w:after="60"/>
+      </w:pPr>
+      <w:r>
+        <w:rPr>
+          <w:rFonts w:ascii="DejaVu Sans" w:cs="DejaVu Sans" w:eastAsia="DejaVu Sans" w:hAnsi="DejaVu Sans"/>
+          <w:color w:val="111827"/>
+          <w:sz w:val="20"/>
+          <w:szCs w:val="20"/>
+        </w:rPr>
+        <w:t xml:space="preserve">4. Daca da, intreaba userul daca vrea sa faca push</w:t>
+      </w:r>
+    </w:p>
+    <w:p>
+      <w:pPr>
+        <w:spacing w:after="60"/>
+      </w:pPr>
+      <w:r>
+        <w:rPr>
+          <w:rFonts w:ascii="DejaVu Sans" w:cs="DejaVu Sans" w:eastAsia="DejaVu Sans" w:hAnsi="DejaVu Sans"/>
+          <w:color w:val="111827"/>
+          <w:sz w:val="20"/>
+          <w:szCs w:val="20"/>
+        </w:rPr>
+        <w:t xml:space="preserve">5. Rezuma ce s-a lucrat in sesiune</w:t>
+      </w:r>
+    </w:p>
+    <w:p>
+      <w:pPr>
+        <w:spacing w:after="60"/>
+      </w:pPr>
+      <w:r>
+        <w:rPr>
+          <w:rFonts w:ascii="DejaVu Sans" w:cs="DejaVu Sans" w:eastAsia="DejaVu Sans" w:hAnsi="DejaVu Sans"/>
+          <w:color w:val="111827"/>
+          <w:sz w:val="20"/>
+          <w:szCs w:val="20"/>
+        </w:rPr>
+        <w:t xml:space="preserve">6. Întreabă userul dacă există un to do list pentru sesiunea viitoare.</w:t>
+      </w:r>
+    </w:p>
+    <w:p>
+      <w:pPr>
+        <w:spacing w:after="60"/>
+      </w:pPr>
+      <w:r>
+        <w:rPr>
+          <w:rFonts w:ascii="DejaVu Sans" w:cs="DejaVu Sans" w:eastAsia="DejaVu Sans" w:hAnsi="DejaVu Sans"/>
+          <w:color w:val="111827"/>
+          <w:sz w:val="20"/>
+          <w:szCs w:val="20"/>
+        </w:rPr>
+        <w:t xml:space="preserve">7. Salvează tot ce este nevoie pentru global memory și ce e specific de salvat pentru proiect</w:t>
+      </w:r>
+    </w:p>
+    <w:p>
+      <w:pPr>
+        <w:spacing w:after="60"/>
+      </w:pPr>
+      <w:r>
+        <w:rPr>
+          <w:rFonts w:ascii="DejaVu Sans" w:cs="DejaVu Sans" w:eastAsia="DejaVu Sans" w:hAnsi="DejaVu Sans"/>
+          <w:color w:val="111827"/>
+          <w:sz w:val="20"/>
+          <w:szCs w:val="20"/>
+        </w:rPr>
+        <w:t xml:space="preserve">8. Exportă sesiunea curentă în DOCX și PDF rulând: `node scripts/export-chat.mjs` din directorul proiectului</w:t>
+      </w:r>
+    </w:p>
+    <w:p>
+      <w:pPr>
+        <w:pBdr>
+          <w:bottom w:val="single" w:color="E5E7EB" w:sz="1"/>
+        </w:pBdr>
+        <w:spacing w:after="200"/>
+      </w:pPr>
+    </w:p>
+    <w:p>
+      <w:pPr>
+        <w:spacing w:after="100" w:before="300"/>
+      </w:pPr>
+      <w:r>
+        <w:rPr>
+          <w:b/>
+          <w:bCs/>
+          <w:color w:val="065F46"/>
+          <w:sz w:val="22"/>
+          <w:szCs w:val="22"/>
+        </w:rPr>
+        <w:t xml:space="preserve">🤖 Claude</w:t>
+      </w:r>
+    </w:p>
+    <w:p>
+      <w:pPr>
+        <w:spacing w:after="60"/>
+      </w:pPr>
+      <w:r>
+        <w:rPr>
+          <w:rFonts w:ascii="DejaVu Sans" w:cs="DejaVu Sans" w:eastAsia="DejaVu Sans" w:hAnsi="DejaVu Sans"/>
+          <w:color w:val="111827"/>
+          <w:sz w:val="20"/>
+          <w:szCs w:val="20"/>
+        </w:rPr>
+        <w:t xml:space="preserve">Sunt modificări la exporturile sesiunii (au fost regenerate cu 49 mesaje în loc de 36). Fac commit și push?</w:t>
+      </w:r>
+    </w:p>
+    <w:p>
+      <w:pPr>
+        <w:pBdr>
+          <w:bottom w:val="single" w:color="E5E7EB" w:sz="1"/>
+        </w:pBdr>
+        <w:spacing w:after="200"/>
+      </w:pPr>
+    </w:p>
+    <w:p>
+      <w:pPr>
+        <w:spacing w:after="100" w:before="300"/>
+      </w:pPr>
+      <w:r>
+        <w:rPr>
+          <w:b/>
+          <w:bCs/>
+          <w:color w:val="1D4ED8"/>
+          <w:sz w:val="22"/>
+          <w:szCs w:val="22"/>
+        </w:rPr>
+        <w:t xml:space="preserve">👤 Tu</w:t>
+      </w:r>
+    </w:p>
+    <w:p>
+      <w:pPr>
+        <w:spacing w:after="60"/>
+      </w:pPr>
+      <w:r>
+        <w:rPr>
+          <w:rFonts w:ascii="DejaVu Sans" w:cs="DejaVu Sans" w:eastAsia="DejaVu Sans" w:hAnsi="DejaVu Sans"/>
+          <w:color w:val="111827"/>
+          <w:sz w:val="20"/>
+          <w:szCs w:val="20"/>
+        </w:rPr>
+        <w:t xml:space="preserve">da</w:t>
+      </w:r>
+    </w:p>
+    <w:p>
+      <w:pPr>
+        <w:pBdr>
+          <w:bottom w:val="single" w:color="E5E7EB" w:sz="1"/>
+        </w:pBdr>
+        <w:spacing w:after="200"/>
+      </w:pPr>
+    </w:p>
+    <w:p>
+      <w:pPr>
+        <w:spacing w:after="100" w:before="300"/>
+      </w:pPr>
+      <w:r>
+        <w:rPr>
+          <w:b/>
+          <w:bCs/>
+          <w:color w:val="065F46"/>
+          <w:sz w:val="22"/>
+          <w:szCs w:val="22"/>
+        </w:rPr>
+        <w:t xml:space="preserve">🤖 Claude</w:t>
+      </w:r>
+    </w:p>
+    <w:p>
+      <w:pPr>
+        <w:spacing w:after="60"/>
+      </w:pPr>
+      <w:r>
+        <w:rPr>
+          <w:rFonts w:ascii="DejaVu Sans" w:cs="DejaVu Sans" w:eastAsia="DejaVu Sans" w:hAnsi="DejaVu Sans"/>
+          <w:color w:val="111827"/>
+          <w:sz w:val="20"/>
+          <w:szCs w:val="20"/>
+        </w:rPr>
+        <w:t xml:space="preserve">Totul salvat. Sesiunea finală: 54 mesaje în [docs/sesiune-2026-04-01.docx](docs/sesiune-2026-04-01.pdf).</w:t>
+      </w:r>
+    </w:p>
+    <w:p>
+      <w:pPr>
+        <w:spacing w:after="60"/>
+      </w:pPr>
+      <w:r>
+        <w:rPr>
+          <w:rFonts w:ascii="DejaVu Sans" w:cs="DejaVu Sans" w:eastAsia="DejaVu Sans" w:hAnsi="DejaVu Sans"/>
+          <w:color w:val="111827"/>
+          <w:sz w:val="20"/>
+          <w:szCs w:val="20"/>
+        </w:rPr>
+        <w:t xml:space="preserve"> </w:t>
+      </w:r>
+    </w:p>
+    <w:p>
+      <w:pPr>
+        <w:spacing w:after="60"/>
+      </w:pPr>
+      <w:r>
+        <w:rPr>
+          <w:rFonts w:ascii="DejaVu Sans" w:cs="DejaVu Sans" w:eastAsia="DejaVu Sans" w:hAnsi="DejaVu Sans"/>
+          <w:color w:val="111827"/>
+          <w:sz w:val="20"/>
+          <w:szCs w:val="20"/>
+        </w:rPr>
+        <w:t xml:space="preserve">**To-do sesiunea viitoare:** Modul 4 — proiect nou, 3 lecții de parcurs.</w:t>
+      </w:r>
+    </w:p>
+    <w:p>
+      <w:pPr>
+        <w:spacing w:after="60"/>
+      </w:pPr>
+      <w:r>
+        <w:rPr>
+          <w:rFonts w:ascii="DejaVu Sans" w:cs="DejaVu Sans" w:eastAsia="DejaVu Sans" w:hAnsi="DejaVu Sans"/>
+          <w:color w:val="111827"/>
+          <w:sz w:val="20"/>
+          <w:szCs w:val="20"/>
+        </w:rPr>
+        <w:t xml:space="preserve"> </w:t>
+      </w:r>
+    </w:p>
+    <w:p>
+      <w:pPr>
+        <w:spacing w:after="60"/>
+      </w:pPr>
+      <w:r>
+        <w:rPr>
+          <w:rFonts w:ascii="DejaVu Sans" w:cs="DejaVu Sans" w:eastAsia="DejaVu Sans" w:hAnsi="DejaVu Sans"/>
+          <w:color w:val="111827"/>
+          <w:sz w:val="20"/>
+          <w:szCs w:val="20"/>
+        </w:rPr>
+        <w:t xml:space="preserve">Pe curând!</w:t>
       </w:r>
     </w:p>
     <w:p>

</xml_diff>